<commit_message>
fix(guide): câu dán không mở bằng tên công cụ — Cowork lấy đó đặt tên phiên
User chụp lại: phiên bị tự đặt tên "Zemory framework setup". Cowork sinh tên
phiên từ câu dán đầu tiên, mà câu tôi viết ở commit trước mở bằng "Dựng bộ khung
làm việc zemory..." nên tên phiên thành tên CÔNG CỤ, không phải việc của user.
Lỗi do chính câu tôi đặt, không phải do Cowork.

Dòng đầu giờ nói về dự án: "Dựng bộ khung làm việc cho dự án trong thư mục tôi
đã gắn." Bỏ chữ zemory khỏi câu không mất thông tin gì — BOOTSTRAP.md và URL đã
tự khai nó là bộ chuẩn nào.

Sửa cả GUIDE.docx lẫn BOOTSTRAP.md để hai nơi không lệch nhau.
bootstrap-manifest 8/8 · conform ✓.

Co-Authored-By: Claude Opus 5 <noreply@anthropic.com>
</commit_message>
<xml_diff>
--- a/docs_template/cowork/GUIDE.docx
+++ b/docs_template/cowork/GUIDE.docx
@@ -584,7 +584,7 @@
           <w:sz w:val="20"/>
           <w:szCs w:val="20"/>
         </w:rPr>
-        <w:t xml:space="preserve">Dựng bộ khung làm việc zemory cho dự án này.</w:t>
+        <w:t xml:space="preserve">Dựng bộ khung làm việc cho dự án trong thư mục tôi đã gắn.</w:t>
       </w:r>
       <w:r/>
     </w:p>
@@ -610,7 +610,7 @@
           <w:sz w:val="20"/>
           <w:szCs w:val="20"/>
         </w:rPr>
-        <w:t xml:space="preserve">Thư mục tôi đã gắn có file BOOTSTRAP.md thì đọc bản đó, không có thì tải bản dưới đây — rồi làm theo đúng những gì trong đó.</w:t>
+        <w:t xml:space="preserve">Thư mục đó có file BOOTSTRAP.md thì đọc bản đó, không có thì tải bản dưới đây — rồi làm theo đúng những gì trong đó.</w:t>
       </w:r>
       <w:r/>
     </w:p>

</xml_diff>

<commit_message>
docs(guide): đảo khuyến nghị sang Skip all approvals (user chốt) · cảnh báo hạ thành "cân nhắc"
Tôi viết ngược ý user ở commit trước: khuyến nghị Automatically approve và ghi
"ĐỪNG chọn Skip all approvals". User chốt ngược — bật Skip cho đỡ phải bấm duyệt
từng lệnh, vì thứ bắt trợ lý dừng lại hỏi là LUẬT trong bộ chuẩn (không ghi đè ·
không tự xoá/dời · việc hệ trọng phải trình rồi chờ gật), không phải mức duyệt.

Cảnh báo giữ nhưng hạ xuống "Cân nhắc trước khi bật", và nêu đúng một dữ kiện:
luật chỉ ràng được SAU KHI bộ chuẩn đã dựng xong — ngay lần chạy đầu thư mục còn
trắng nên chưa có gì ràng. Kèm hai điều kiện phải chắc (gắn đúng thư mục dự án,
thư mục đã có bản sao hoặc đã commit git) và một lối thận trọng cho ai chưa yên
tâm (lần đầu để Automatically, xong mới chuyển Skip).

Tiêu đề bước đổi thành "Bỏ bước duyệt từng lệnh" cho khớp việc thật.
BOOTSTRAP.md §Cách khởi động đảo y hệt. bootstrap-manifest 8/8 · conform ✓.

Co-Authored-By: Claude Opus 5 <noreply@anthropic.com>
</commit_message>
<xml_diff>
--- a/docs_template/cowork/GUIDE.docx
+++ b/docs_template/cowork/GUIDE.docx
@@ -388,12 +388,12 @@
         <w:rPr>
           <w:b/>
         </w:rPr>
-        <w:t xml:space="preserve">Rồi — Bật tự động duyệt</w:t>
+        <w:t xml:space="preserve">Rồi — Bỏ bước duyệt từng lệnh</w:t>
       </w:r>
     </w:p>
     <w:p>
       <w:r>
-        <w:t xml:space="preserve">Ở ô chat bấm Auto → chọn Automatically approve (đang chọn sẵn thì thôi). Không bật thì trợ lý phải xin phép từng lệnh, dựng bộ khung sẽ dừng liên tục.</w:t>
+        <w:t xml:space="preserve">Ở ô chat bấm Auto → chọn Skip all approvals, khỏi phải bấm duyệt từng lệnh. Bộ chuẩn đã tự mang luật kiểm soát — không ghi đè file đang có, không tự xoá hay dời file của bạn, việc hệ trọng phải trình rồi chờ bạn gật — nên chính luật đó mới là thứ bắt trợ lý dừng lại hỏi, không phải mức duyệt.</w:t>
       </w:r>
     </w:p>
     <w:p>
@@ -454,7 +454,7 @@
           <w:sz w:val="21"/>
           <w:szCs w:val="21"/>
         </w:rPr>
-        <w:t xml:space="preserve">Đừng chọn Skip all approvals. </w:t>
+        <w:t xml:space="preserve">Cân nhắc trước khi bật. </w:t>
       </w:r>
       <w:r>
         <w:rPr>
@@ -463,7 +463,7 @@
           <w:sz w:val="21"/>
           <w:szCs w:val="21"/>
         </w:rPr>
-        <w:t xml:space="preserve">Mức đó trợ lý không bao giờ dừng, kể cả với hành động không an toàn — chính Claude ghi vậy ngay trong menu. Automatically approve là đủ. Nhưng từ lúc bật, trợ lý tự chạy lệnh và tự ghi file mà không hỏi lại từng bước, nên kiểm hai điều trước: đã gắn ĐÚNG thư mục dự án (đừng gắn cả ổ đĩa hay thư mục cha), và thư mục đó đã có bản sao hoặc đã commit git.</w:t>
+        <w:t xml:space="preserve">Ở mức này trợ lý không dừng lại hỏi, kể cả với hành động không an toàn — chính Claude ghi vậy trong menu. Thứ giữ an toàn lúc đó là luật trong bộ chuẩn, mà luật chỉ ràng được sau khi bộ chuẩn đã dựng xong: ngay lần chạy đầu thư mục còn trắng nên chưa có gì ràng cả. Vì vậy chỉ bật khi đã gắn ĐÚNG thư mục dự án — đừng gắn cả ổ đĩa hay thư mục cha — và thư mục đó đã có bản sao hoặc đã commit git. Chưa yên tâm thì để Automatically approve cho lần dựng đầu, xong rồi mới chuyển sang Skip.</w:t>
       </w:r>
       <w:r/>
     </w:p>

</xml_diff>

<commit_message>
docs(guide): bỏ ảnh giữ chỗ cuối — ảnh chỉ dành cho bước phải BẤM NÚT (user chốt)
Luật user chốt: chỉ chụp bước phải bấm nút. Phần trợ lý hỏi–đáp thì UI tự hiện,
người dùng tự trả lời, chụp vào là thừa.

Bước "Dán câu lệnh" không có nút nào để chỉ — dán chữ rồi Enter. Nên ảnh giữ chỗ
cuối cùng bỏ hẳn thay vì chờ chụp: gỡ khỏi docx (đoạn + media + rel), gỡ khỏi
img/, và bỏ luôn dòng ghi chú "còn là ảnh giữ chỗ" vì không còn cái nào.

GUIDE.docx giờ 0 giữ chỗ: 3 ảnh nút thật (Create new project · Add a folder ·
menu Auto) + 3 sơ đồ. Không rel mồ vàng, không ảnh mồ vàng.

Đóng mục backlog "còn 1 ảnh giữ chỗ" và ghi 06_CHANGES cho cả cụm việc guide hôm
nay — gồm cả hai nhịp tôi làm sai rồi phải dựng lại.

bootstrap-manifest 8/8 · conform ✓ · reindex · validate ✓.

Co-Authored-By: Claude Opus 5 <noreply@anthropic.com>
</commit_message>
<xml_diff>
--- a/docs_template/cowork/GUIDE.docx
+++ b/docs_template/cowork/GUIDE.docx
@@ -491,99 +491,6 @@
       </w:pPr>
       <w:r>
         <w:t xml:space="preserve">Ở ô chat, dán câu ở phần “Lần đầu — nhờ dựng bộ khung” ngay bên dưới. Trợ lý sẽ tự làm phần còn lại.</w:t>
-      </w:r>
-      <w:r/>
-    </w:p>
-    <w:p>
-      <w:pPr>
-        <w:pBdr/>
-        <w:spacing/>
-        <w:ind/>
-        <w:rPr/>
-      </w:pPr>
-      <w:r>
-        <mc:AlternateContent>
-          <mc:Choice Requires="wpg">
-            <w:drawing>
-              <wp:inline xmlns:wp="http://schemas.openxmlformats.org/drawingml/2006/wordprocessingDrawing" distT="0" distB="0" distL="0" distR="0">
-                <wp:extent cx="5120640" cy="2432304"/>
-                <wp:effectExtent l="0" t="0" r="0" b="0"/>
-                <wp:docPr id="3" name="Picture 4"/>
-                <wp:cNvGraphicFramePr>
-                  <a:graphicFrameLocks xmlns:a="http://schemas.openxmlformats.org/drawingml/2006/main" noChangeAspect="1"/>
-                </wp:cNvGraphicFramePr>
-                <a:graphic xmlns:a="http://schemas.openxmlformats.org/drawingml/2006/main">
-                  <a:graphicData uri="http://schemas.openxmlformats.org/drawingml/2006/picture">
-                    <pic:pic xmlns:pic="http://schemas.openxmlformats.org/drawingml/2006/picture">
-                      <pic:nvPicPr>
-                        <pic:cNvPr id="0" name="step_paste_command.png"/>
-                        <pic:cNvPicPr>
-                          <a:picLocks noChangeAspect="1"/>
-                        </pic:cNvPicPr>
-                        <pic:nvPr/>
-                      </pic:nvPicPr>
-                      <pic:blipFill rotWithShape="1">
-                        <a:blip r:embed="rId12"/>
-                        <a:stretch/>
-                      </pic:blipFill>
-                      <pic:spPr bwMode="auto">
-                        <a:xfrm>
-                          <a:off x="0" y="0"/>
-                          <a:ext cx="5120640" cy="2432303"/>
-                        </a:xfrm>
-                        <a:prstGeom prst="rect">
-                          <a:avLst/>
-                        </a:prstGeom>
-                      </pic:spPr>
-                    </pic:pic>
-                  </a:graphicData>
-                </a:graphic>
-              </wp:inline>
-            </w:drawing>
-          </mc:Choice>
-          <mc:Fallback>
-            <w:pict>
-              <v:shapetype id="_x0000_t75" coordsize="21600,21600" o:spt="75" o:preferrelative="t" path="m@4@5l@4@11@9@11@9@5xe" filled="f" stroked="f">
-                <v:stroke joinstyle="miter"/>
-                <v:formulas>
-                  <v:f eqn="if lineDrawn pixelLineWidth 0"/>
-                  <v:f eqn="sum @0 1 0"/>
-                  <v:f eqn="sum 0 0 @1"/>
-                  <v:f eqn="prod @2 1 2"/>
-                  <v:f eqn="prod @3 21600 pixelWidth"/>
-                  <v:f eqn="prod @3 21600 pixelHeight"/>
-                  <v:f eqn="sum @0 0 1"/>
-                  <v:f eqn="prod @6 1 2"/>
-                  <v:f eqn="prod @7 21600 pixelWidth"/>
-                  <v:f eqn="sum @8 21600 0"/>
-                  <v:f eqn="prod @7 21600 pixelHeight"/>
-                  <v:f eqn="sum @10 21600 0"/>
-                </v:formulas>
-                <v:path o:extrusionok="f" gradientshapeok="t" o:connecttype="rect"/>
-                <o:lock v:ext="edit" aspectratio="t"/>
-              </v:shapetype>
-              <v:shape id="_x0000_i2" o:spid="_x0000_s2" type="#_x0000_t75" style="width:403.20pt;height:191.52pt;mso-wrap-distance-left:0.00pt;mso-wrap-distance-top:0.00pt;mso-wrap-distance-right:0.00pt;mso-wrap-distance-bottom:0.00pt;z-index:1;" stroked="false">
-                <v:imagedata r:id="rId12" o:title=""/>
-                <o:lock v:ext="edit" rotation="t"/>
-              </v:shape>
-            </w:pict>
-          </mc:Fallback>
-        </mc:AlternateContent>
-      </w:r>
-      <w:r/>
-    </w:p>
-    <w:p>
-      <w:pPr>
-        <w:pBdr/>
-        <w:spacing/>
-        <w:ind/>
-        <w:rPr/>
-      </w:pPr>
-      <w:r>
-        <w:rPr>
-          <w:i/>
-        </w:rPr>
-        <w:t xml:space="preserve">Ảnh phần dán câu lệnh còn là ảnh giữ chỗ — thay bằng ảnh chụp màn hình thật khi có.</w:t>
       </w:r>
       <w:r/>
     </w:p>

</xml_diff>

<commit_message>
docs(guide): ảnh THẬT cho bước dán câu lệnh — ô chat có nút gửi nên vẫn thuộc diện chụp
Lượt trước tôi áp luật "chỉ chụp bước phải bấm nút" quá rộng và gỡ luôn ảnh của
bước này. User chỉ lại: ô chat có nút gửi, vẫn là chỗ phải bấm. Đưa ảnh thật vào
(ô chat đã dán sẵn câu prompt + nút gửi), crop sát nên đọc rõ chữ.

Dùng lại tên media image3.png vừa được giải phóng cho khỏi đẻ số mới vô cớ; vỏ
đoạn sao từ ảnh bước "bỏ duyệt", docPr id cấp mới. Rộng = khổ chữ 15.92 cm, cao
theo tỷ lệ gốc (2.857).

GUIDE.docx giờ 4 ảnh nút + 3 sơ đồ, 0 giữ chỗ. Kiểm: mọi embed có rel, không rel
mồ vàng, không ảnh mồ vàng, không docPr trùng, không ảnh vượt khổ chữ.
Sửa lại 06_CHANGES cho khớp (mục vừa ghi nói "3 ảnh nút" và nói tôi bỏ hẳn ảnh này).

bootstrap-manifest 8/8 · conform ✓.

Co-Authored-By: Claude Opus 5 <noreply@anthropic.com>
</commit_message>
<xml_diff>
--- a/docs_template/cowork/GUIDE.docx
+++ b/docs_template/cowork/GUIDE.docx
@@ -493,6 +493,42 @@
         <w:t xml:space="preserve">Ở ô chat, dán câu ở phần “Lần đầu — nhờ dựng bộ khung” ngay bên dưới. Trợ lý sẽ tự làm phần còn lại.</w:t>
       </w:r>
       <w:r/>
+    </w:p>
+    <w:p>
+      <w:r>
+        <w:drawing>
+          <wp:inline xmlns:a="http://schemas.openxmlformats.org/drawingml/2006/main" xmlns:pic="http://schemas.openxmlformats.org/drawingml/2006/picture">
+            <wp:extent cx="5731510" cy="2006388"/>
+            <wp:docPr id="5" name="Picture 5"/>
+            <wp:cNvGraphicFramePr>
+              <a:graphicFrameLocks noChangeAspect="1"/>
+            </wp:cNvGraphicFramePr>
+            <a:graphic>
+              <a:graphicData uri="http://schemas.openxmlformats.org/drawingml/2006/picture">
+                <pic:pic>
+                  <pic:nvPicPr>
+                    <pic:cNvPr id="0" name="step_paste_command.png"/>
+                    <pic:cNvPicPr/>
+                  </pic:nvPicPr>
+                  <pic:blipFill>
+                    <a:blip r:embed="rId19"/>
+                    <a:stretch>
+                      <a:fillRect/>
+                    </a:stretch>
+                  </pic:blipFill>
+                  <pic:spPr>
+                    <a:xfrm>
+                      <a:off x="0" y="0"/>
+                      <a:ext cx="5731510" cy="2006388"/>
+                    </a:xfrm>
+                    <a:prstGeom prst="rect"/>
+                  </pic:spPr>
+                </pic:pic>
+              </a:graphicData>
+            </a:graphic>
+          </wp:inline>
+        </w:drawing>
+      </w:r>
     </w:p>
     <w:p>
       <w:pPr>

</xml_diff>

<commit_message>
docs(guide): mức nỗ lực nào cho model nào — 4.8 mức nào cũng ổn, Opus 5 nên High trở lên
User cho biết từ thực tế dùng: Opus 4.8 chạy ổn ở mọi mức nỗ lực; Opus 5 thì nên
để High trở lên, thấp hơn hay làm hụt việc. Hai mức trên cùng (Extra · Max) đắt
hẳn — kỹ hơn nhưng tốn hạn mức nhiều hơn rất nhiều, để dành việc thật sự khó,
đừng bật mặc định.

Viết theo NHÃN người đọc thấy trên menu Cowork (Low · Medium · High · Extra · Max).
User gọi mức trên cùng là 'xhigh/ultracore' — đó là tên Claude Code dùng; guide
giữ nhãn của Cowork để người đọc tìm đúng chỗ bấm.

Đo lại trang: 14 trang, giữa bài cao nhất 29% — đạt ràng buộc, không phải tối ưu lại.

Co-Authored-By: Claude Opus 5 <noreply@anthropic.com>
</commit_message>
<xml_diff>
--- a/docs_template/cowork/GUIDE.docx
+++ b/docs_template/cowork/GUIDE.docx
@@ -1947,6 +1947,41 @@
         </mc:AlternateContent>
       </w:r>
       <w:r/>
+      <w:r/>
+    </w:p>
+    <w:p>
+      <w:pPr>
+        <w:pBdr>
+          <w:top w:val="single" w:color="b7791f" w:sz="2" w:space="0"/>
+          <w:left w:val="single" w:color="b7791f" w:sz="18" w:space="0"/>
+          <w:bottom w:val="single" w:color="b7791f" w:sz="2" w:space="0"/>
+          <w:right w:val="single" w:color="b7791f" w:sz="2" w:space="0"/>
+        </w:pBdr>
+        <w:shd w:val="clear" w:color="auto" w:fill="fcf3e8"/>
+        <w:spacing w:after="170" w:before="80"/>
+        <w:ind/>
+        <w:rPr/>
+      </w:pPr>
+      <w:r>
+        <w:rPr>
+          <w:rFonts w:ascii="Calibri" w:hAnsi="Calibri" w:eastAsia="Calibri" w:cs="Calibri"/>
+          <w:b/>
+          <w:bCs/>
+          <w:color w:val="b7791f"/>
+          <w:sz w:val="21"/>
+          <w:szCs w:val="21"/>
+        </w:rPr>
+        <w:t xml:space="preserve">Mức nào cho model nào.  </w:t>
+      </w:r>
+      <w:r>
+        <w:rPr>
+          <w:rFonts w:ascii="Calibri" w:hAnsi="Calibri" w:eastAsia="Calibri" w:cs="Calibri"/>
+          <w:color w:val="1a2233"/>
+          <w:sz w:val="21"/>
+          <w:szCs w:val="21"/>
+        </w:rPr>
+        <w:t xml:space="preserve">Opus 4.8 chạy ổn ở mọi mức — chọn theo việc là được. Opus 5 thì nên để High trở lên; thấp hơn nó hay làm hụt việc. Hai mức trên cùng (Extra · Max) đắt hẳn: kỹ hơn nhưng tốn hạn mức nhiều hơn rất nhiều, nên để dành cho việc thật sự khó — đừng bật mặc định cho mọi phiên.</w:t>
+      </w:r>
       <w:r/>
     </w:p>
     <w:p>

</xml_diff>